<commit_message>
Update public CV and 433 experience in all languages
</commit_message>
<xml_diff>
--- a/public/resume/amine-boularbah-resume-es.docx
+++ b/public/resume/amine-boularbah-resume-es.docx
@@ -120,7 +120,7 @@
         <w:pStyle w:val="Heading2"/>
       </w:pPr>
       <w:r>
-        <w:t>Lead Mobile Engineer en 433</w:t>
+        <w:t>Lead Mobile Engineer en 433 football</w:t>
       </w:r>
     </w:p>
     <w:p>
@@ -128,7 +128,7 @@
         <w:keepNext/>
       </w:pPr>
       <w:r>
-        <w:t>En remoto (empresa con sede en la UE) · Septiembre de 2025 a la actualidad</w:t>
+        <w:t>Málaga, España · En remoto · Septiembre de 2025 a la actualidad</w:t>
       </w:r>
     </w:p>
     <w:p>
@@ -136,7 +136,40 @@
         <w:pStyle w:val="ListBullet"/>
       </w:pPr>
       <w:r>
-        <w:t>Lidero un equipo de 5 ingenieros en la reconstrucción completa de la aplicación móvil oficial de 433, dirigida a una comunidad mundial de más de 77 millones de aficionados al fútbol</w:t>
+        <w:t xml:space="preserve">Lidero un equipo de 5 ingenieros encargado de reconstruir la </w:t>
+      </w:r>
+      <w:r>
+        <w:rPr>
+          <w:b/>
+        </w:rPr>
+        <w:t>aplicación móvil oficial de 433</w:t>
+      </w:r>
+      <w:r>
+        <w:t xml:space="preserve">, al servicio de una comunidad mundial de </w:t>
+      </w:r>
+      <w:r>
+        <w:rPr>
+          <w:b/>
+        </w:rPr>
+        <w:t>más de 77 millones de aficionados al fútbol</w:t>
+      </w:r>
+      <w:r/>
+    </w:p>
+    <w:p>
+      <w:pPr>
+        <w:pStyle w:val="ListBullet"/>
+      </w:pPr>
+      <w:r>
+        <w:t xml:space="preserve">Diseñé la aplicación desde cero con </w:t>
+      </w:r>
+      <w:r>
+        <w:rPr>
+          <w:b/>
+        </w:rPr>
+        <w:t>Clean Architecture, BLoC y un monorepositorio con múltiples paquetes</w:t>
+      </w:r>
+      <w:r>
+        <w:t>, estableciendo la base del desarrollo móvil en 433</w:t>
       </w:r>
     </w:p>
     <w:p>
@@ -144,7 +177,49 @@
         <w:pStyle w:val="ListBullet"/>
       </w:pPr>
       <w:r>
-        <w:t>Diseñé la aplicación desde cero con Clean Architecture, un monorepositorio multimódulo y una gestión de estado escalable, que ahora sustentan todo el desarrollo móvil de 433</w:t>
+        <w:t xml:space="preserve">Diseñé e implementé </w:t>
+      </w:r>
+      <w:r>
+        <w:rPr>
+          <w:b/>
+        </w:rPr>
+        <w:t>actualizaciones en tiempo real con SignalR</w:t>
+      </w:r>
+      <w:r>
+        <w:t xml:space="preserve"> y experiencias nativas de seguimiento en directo con </w:t>
+      </w:r>
+      <w:r>
+        <w:rPr>
+          <w:b/>
+        </w:rPr>
+        <w:t>Swift/SwiftUI y ActivityKit en iOS</w:t>
+      </w:r>
+      <w:r>
+        <w:t xml:space="preserve"> y </w:t>
+      </w:r>
+      <w:r>
+        <w:rPr>
+          <w:b/>
+        </w:rPr>
+        <w:t>Kotlin en Android</w:t>
+      </w:r>
+      <w:r/>
+    </w:p>
+    <w:p>
+      <w:pPr>
+        <w:pStyle w:val="ListBullet"/>
+      </w:pPr>
+      <w:r>
+        <w:t xml:space="preserve">Me responsabilicé de integraciones complejas, como </w:t>
+      </w:r>
+      <w:r>
+        <w:rPr>
+          <w:b/>
+        </w:rPr>
+        <w:t>Segment CDP y Airship</w:t>
+      </w:r>
+      <w:r>
+        <w:t>, en colaboración con los equipos de marketing y analítica para cubrir los requisitos de seguimiento, interacción y datos de clientes</w:t>
       </w:r>
     </w:p>
     <w:p>
@@ -152,7 +227,25 @@
         <w:pStyle w:val="ListBullet"/>
       </w:pPr>
       <w:r>
-        <w:t>Soy responsable de las decisiones técnicas del equipo móvil, incluida la estrategia de pruebas, los pipelines CI/CD, los estándares de código y las revisiones de arquitectura</w:t>
+        <w:t xml:space="preserve">Optimicé los </w:t>
+      </w:r>
+      <w:r>
+        <w:rPr>
+          <w:b/>
+        </w:rPr>
+        <w:t>pipelines CI/CD de GitHub Actions/Fastlane</w:t>
+      </w:r>
+      <w:r>
+        <w:t xml:space="preserve">, reduciendo el tiempo de ejecución un </w:t>
+      </w:r>
+      <w:r>
+        <w:rPr>
+          <w:b/>
+        </w:rPr>
+        <w:t>47 %</w:t>
+      </w:r>
+      <w:r>
+        <w:t xml:space="preserve"> y acelerando los ciclos de desarrollo y publicación</w:t>
       </w:r>
     </w:p>
     <w:p>
@@ -160,23 +253,16 @@
         <w:pStyle w:val="ListBullet"/>
       </w:pPr>
       <w:r>
-        <w:t>Dirijo integraciones complejas de terceros, como Airship, Segment y la infraestructura de analítica</w:t>
+        <w:t xml:space="preserve">Soy responsable de la arquitectura, las decisiones técnicas y la entrega de funcionalidades complejas, mientras </w:t>
       </w:r>
-    </w:p>
-    <w:p>
-      <w:pPr>
-        <w:pStyle w:val="ListBullet"/>
-      </w:pPr>
       <w:r>
-        <w:t>Colaboro con los responsables de producto, diseño y backend para evaluar la viabilidad de la hoja de ruta y definir las prioridades técnicas</w:t>
+        <w:rPr>
+          <w:b/>
+        </w:rPr>
+        <w:t>acompaño a 5 ingenieros</w:t>
       </w:r>
-    </w:p>
-    <w:p>
-      <w:pPr>
-        <w:pStyle w:val="ListBullet"/>
-      </w:pPr>
       <w:r>
-        <w:t>Acompaño a los ingenieros en arquitectura, gestión de estado con BLoC y calidad del código, mejorando la eficacia y la coherencia del trabajo del equipo</w:t>
+        <w:t>, reviso pull requests e impulso los estándares de ingeniería del equipo móvil</w:t>
       </w:r>
     </w:p>
     <w:p>
@@ -192,7 +278,7 @@
         <w:keepNext/>
       </w:pPr>
       <w:r>
-        <w:t>En remoto (empresa con sede en EE. UU.) · Septiembre de 2021 a agosto de 2025</w:t>
+        <w:t>En remoto · Septiembre de 2021 a agosto de 2025</w:t>
       </w:r>
     </w:p>
     <w:p>
@@ -337,7 +423,7 @@
         <w:pStyle w:val="Heading1"/>
       </w:pPr>
       <w:r>
-        <w:t>Productos</w:t>
+        <w:t>Productos independientes</w:t>
       </w:r>
     </w:p>
     <w:p>
@@ -345,7 +431,7 @@
         <w:pStyle w:val="Heading2"/>
       </w:pPr>
       <w:r>
-        <w:t>Fundador y desarrollador de Receipto</w:t>
+        <w:t>Fundador e ingeniero móvil en AppWrapp LLC</w:t>
       </w:r>
     </w:p>
     <w:p>
@@ -353,7 +439,12 @@
         <w:keepNext/>
       </w:pPr>
       <w:r>
-        <w:t xml:space="preserve">Málaga · Mayo de 2025 a la actualidad · </w:t>
+        <w:t>Málaga, España · En remoto · Enero de 2024 a la actualidad</w:t>
+      </w:r>
+    </w:p>
+    <w:p>
+      <w:r>
+        <w:t xml:space="preserve">Desarrollo y mantengo productos de software independientes a través de </w:t>
       </w:r>
       <w:hyperlink r:id="rId14">
         <w:r>
@@ -361,103 +452,53 @@
             <w:color w:val="000000"/>
             <w:u w:val="single"/>
           </w:rPr>
-          <w:t>receipto.app</w:t>
+          <w:t>AppWrapp</w:t>
         </w:r>
       </w:hyperlink>
-      <w:r/>
-    </w:p>
-    <w:p>
       <w:r>
-        <w:t>Desarrollé y lancé una aplicación iOS para escanear recibos y gestionar gastos mediante IA, que genera ingresos recurrentes y cuenta con más de 400 valoraciones en el App Store. Responsabilidad completa sobre el producto, la arquitectura, la integración de IA, la optimización en el App Store y la adquisición de pago. Incluye reconocimiento de texto con IA, una bandeja Magic Email para procesar recibos automáticamente y exportaciones para la preparación de impuestos.</w:t>
+        <w:t>, responsabilizándome del desarrollo de producto, la arquitectura técnica, las integraciones, las publicaciones y las mejoras continuas.</w:t>
       </w:r>
     </w:p>
     <w:p>
       <w:pPr>
-        <w:pStyle w:val="Heading2"/>
+        <w:pStyle w:val="ListBullet"/>
       </w:pPr>
-      <w:r>
-        <w:t>Fundador y desarrollador de Fielduro</w:t>
-      </w:r>
-    </w:p>
-    <w:p>
-      <w:pPr>
-        <w:keepNext/>
-      </w:pPr>
-      <w:r>
-        <w:t xml:space="preserve">Málaga · Actualidad · </w:t>
-      </w:r>
+      <w:r/>
       <w:hyperlink r:id="rId15">
         <w:r>
           <w:rPr>
             <w:color w:val="000000"/>
             <w:u w:val="single"/>
           </w:rPr>
-          <w:t>fielduro.com</w:t>
+          <w:t>Receipto</w:t>
         </w:r>
       </w:hyperlink>
-      <w:r/>
-    </w:p>
-    <w:p>
       <w:r>
-        <w:t>Desarrollé un producto para profesionales y empresas de servicios independientes que conecta presupuestos, órdenes de trabajo, facturas y recibos. Diseñé documentos vinculados a cada trabajo, PDF listos para enviar a clientes y seguimiento de pagos.</w:t>
+        <w:t>: Desarrollé y lancé una aplicación de gestión de recibos con escaneo inteligente, procesamiento automático de recibos por correo electrónico y funciones de exportación para autónomos y pequeñas empresas.</w:t>
       </w:r>
     </w:p>
     <w:p>
       <w:pPr>
-        <w:pStyle w:val="Heading2"/>
+        <w:pStyle w:val="ListBullet"/>
       </w:pPr>
-      <w:r>
-        <w:t>Fundador y desarrollador de Flura</w:t>
-      </w:r>
-    </w:p>
-    <w:p>
-      <w:pPr>
-        <w:keepNext/>
-      </w:pPr>
-      <w:r>
-        <w:t xml:space="preserve">Málaga · Enero de 2026 a la actualidad · </w:t>
-      </w:r>
+      <w:r/>
       <w:hyperlink r:id="rId16">
         <w:r>
           <w:rPr>
             <w:color w:val="000000"/>
             <w:u w:val="single"/>
           </w:rPr>
-          <w:t>flura.app</w:t>
+          <w:t>Fielduro</w:t>
         </w:r>
       </w:hyperlink>
-      <w:r/>
-    </w:p>
-    <w:p>
       <w:r>
-        <w:t>Desarrollé y lancé una aplicación de seguimiento de salud para personas con enfermedades crónicas, con reconocimiento de patrones mediante IA e informes PDF estructurados para médicos. Responsabilidad de principio a fin: aplicación Flutter, generación de informes con IA, infraestructura de analítica y estrategia de crecimiento.</w:t>
+        <w:t>: Desarrollé flujos de trabajo conectados para presupuestos, órdenes de trabajo, facturas y recibos, con PDF listos para enviar a clientes y seguimiento de pagos para profesionales y empresas de servicios independientes.</w:t>
       </w:r>
     </w:p>
     <w:p>
       <w:pPr>
-        <w:pStyle w:val="Heading1"/>
+        <w:pStyle w:val="ListBullet"/>
       </w:pPr>
-      <w:r>
-        <w:t>Certificaciones</w:t>
-      </w:r>
-    </w:p>
-    <w:p>
-      <w:pPr>
-        <w:pStyle w:val="Heading2"/>
-      </w:pPr>
-      <w:r>
-        <w:t>Certificado profesional de desarrollador iOS, Meta</w:t>
-      </w:r>
-    </w:p>
-    <w:p>
-      <w:pPr>
-        <w:keepNext w:val="0"/>
-      </w:pPr>
-      <w:r>
-        <w:t>Agosto de 2024 a noviembre de 2024</w:t>
-      </w:r>
-    </w:p>
-    <w:p>
       <w:r/>
       <w:hyperlink r:id="rId17">
         <w:r>
@@ -465,39 +506,17 @@
             <w:color w:val="000000"/>
             <w:u w:val="single"/>
           </w:rPr>
-          <w:t>Verificar el certificado de iOS en Coursera</w:t>
+          <w:t>Flura</w:t>
         </w:r>
       </w:hyperlink>
-      <w:r/>
-    </w:p>
-    <w:p>
-      <w:pPr>
-        <w:pStyle w:val="Heading2"/>
-      </w:pPr>
       <w:r>
-        <w:t>Certificado de React Native, Meta</w:t>
+        <w:t>: Desarrollé y lancé una aplicación de seguimiento de salud para personas con enfermedades crónicas, con registro de síntomas, historial de salud e informes que se pueden compartir en las consultas médicas.</w:t>
       </w:r>
     </w:p>
     <w:p>
-      <w:pPr>
-        <w:keepNext w:val="0"/>
-      </w:pPr>
       <w:r>
-        <w:t>2024</w:t>
+        <w:t>Mis responsabilidades técnicas abarcan el desarrollo de aplicaciones, las integraciones backend, la facturación de suscripciones, la analítica, la optimización en el App Store y el crecimiento del producto.</w:t>
       </w:r>
-    </w:p>
-    <w:p>
-      <w:r/>
-      <w:hyperlink r:id="rId18">
-        <w:r>
-          <w:rPr>
-            <w:color w:val="000000"/>
-            <w:u w:val="single"/>
-          </w:rPr>
-          <w:t>Verificar el certificado de React Native en Coursera</w:t>
-        </w:r>
-      </w:hyperlink>
-      <w:r/>
     </w:p>
     <w:p>
       <w:pPr>
@@ -528,12 +547,49 @@
         <w:pStyle w:val="Heading1"/>
       </w:pPr>
       <w:r>
+        <w:t>Certificaciones</w:t>
+      </w:r>
+    </w:p>
+    <w:p>
+      <w:pPr>
+        <w:pStyle w:val="Heading2"/>
+      </w:pPr>
+      <w:r>
+        <w:t>Certificado profesional de desarrollador iOS, Meta</w:t>
+      </w:r>
+    </w:p>
+    <w:p>
+      <w:pPr>
+        <w:keepNext w:val="0"/>
+      </w:pPr>
+      <w:r>
+        <w:t>Agosto de 2024 a noviembre de 2024</w:t>
+      </w:r>
+    </w:p>
+    <w:p>
+      <w:r/>
+      <w:hyperlink r:id="rId18">
+        <w:r>
+          <w:rPr>
+            <w:color w:val="000000"/>
+            <w:u w:val="single"/>
+          </w:rPr>
+          <w:t>Verificar el certificado de iOS en Coursera</w:t>
+        </w:r>
+      </w:hyperlink>
+      <w:r/>
+    </w:p>
+    <w:p>
+      <w:pPr>
+        <w:pStyle w:val="Heading1"/>
+      </w:pPr>
+      <w:r>
         <w:t>Competencias</w:t>
       </w:r>
     </w:p>
     <w:p>
       <w:r>
-        <w:t>Flutter/Dart; Swift/SwiftUI; Kotlin/Java; React Native; NestJS/TypeScript; Suite de Firebase; PostgreSQL; Clean Architecture; MVC/MVVM; Riverpod/Provider; BLoC/Cubit; API REST/GraphQL; Git/GitFlow; Codemagic; Pruebas unitarias, de integración y de interfaz; Desarrollo guiado por pruebas (TDD); Metodologías ágiles (Scrum/Kanban); Liderazgo y gestión de equipos</w:t>
+        <w:t>Flutter/Dart; Swift/SwiftUI; Kotlin/Java; NestJS/TypeScript; Clean Architecture; MVC/MVVM; Riverpod/Provider; BLoC/Cubit; API REST/GraphQL; Git/GitFlow; Codemagic; Pruebas unitarias, de integración y de interfaz; Desarrollo guiado por pruebas (TDD); Metodologías ágiles (Scrum/Kanban); Liderazgo y gestión de equipos</w:t>
       </w:r>
     </w:p>
     <w:p>

</xml_diff>

<commit_message>
Update public CV and 433 experience in all languages (#12)
</commit_message>
<xml_diff>
--- a/public/resume/amine-boularbah-resume-es.docx
+++ b/public/resume/amine-boularbah-resume-es.docx
@@ -120,7 +120,7 @@
         <w:pStyle w:val="Heading2"/>
       </w:pPr>
       <w:r>
-        <w:t>Lead Mobile Engineer en 433</w:t>
+        <w:t>Lead Mobile Engineer en 433 football</w:t>
       </w:r>
     </w:p>
     <w:p>
@@ -128,7 +128,7 @@
         <w:keepNext/>
       </w:pPr>
       <w:r>
-        <w:t>En remoto (empresa con sede en la UE) · Septiembre de 2025 a la actualidad</w:t>
+        <w:t>Málaga, España · En remoto · Septiembre de 2025 a la actualidad</w:t>
       </w:r>
     </w:p>
     <w:p>
@@ -136,7 +136,40 @@
         <w:pStyle w:val="ListBullet"/>
       </w:pPr>
       <w:r>
-        <w:t>Lidero un equipo de 5 ingenieros en la reconstrucción completa de la aplicación móvil oficial de 433, dirigida a una comunidad mundial de más de 77 millones de aficionados al fútbol</w:t>
+        <w:t xml:space="preserve">Lidero un equipo de 5 ingenieros encargado de reconstruir la </w:t>
+      </w:r>
+      <w:r>
+        <w:rPr>
+          <w:b/>
+        </w:rPr>
+        <w:t>aplicación móvil oficial de 433</w:t>
+      </w:r>
+      <w:r>
+        <w:t xml:space="preserve">, al servicio de una comunidad mundial de </w:t>
+      </w:r>
+      <w:r>
+        <w:rPr>
+          <w:b/>
+        </w:rPr>
+        <w:t>más de 77 millones de aficionados al fútbol</w:t>
+      </w:r>
+      <w:r/>
+    </w:p>
+    <w:p>
+      <w:pPr>
+        <w:pStyle w:val="ListBullet"/>
+      </w:pPr>
+      <w:r>
+        <w:t xml:space="preserve">Diseñé la aplicación desde cero con </w:t>
+      </w:r>
+      <w:r>
+        <w:rPr>
+          <w:b/>
+        </w:rPr>
+        <w:t>Clean Architecture, BLoC y un monorepositorio con múltiples paquetes</w:t>
+      </w:r>
+      <w:r>
+        <w:t>, estableciendo la base del desarrollo móvil en 433</w:t>
       </w:r>
     </w:p>
     <w:p>
@@ -144,7 +177,49 @@
         <w:pStyle w:val="ListBullet"/>
       </w:pPr>
       <w:r>
-        <w:t>Diseñé la aplicación desde cero con Clean Architecture, un monorepositorio multimódulo y una gestión de estado escalable, que ahora sustentan todo el desarrollo móvil de 433</w:t>
+        <w:t xml:space="preserve">Diseñé e implementé </w:t>
+      </w:r>
+      <w:r>
+        <w:rPr>
+          <w:b/>
+        </w:rPr>
+        <w:t>actualizaciones en tiempo real con SignalR</w:t>
+      </w:r>
+      <w:r>
+        <w:t xml:space="preserve"> y experiencias nativas de seguimiento en directo con </w:t>
+      </w:r>
+      <w:r>
+        <w:rPr>
+          <w:b/>
+        </w:rPr>
+        <w:t>Swift/SwiftUI y ActivityKit en iOS</w:t>
+      </w:r>
+      <w:r>
+        <w:t xml:space="preserve"> y </w:t>
+      </w:r>
+      <w:r>
+        <w:rPr>
+          <w:b/>
+        </w:rPr>
+        <w:t>Kotlin en Android</w:t>
+      </w:r>
+      <w:r/>
+    </w:p>
+    <w:p>
+      <w:pPr>
+        <w:pStyle w:val="ListBullet"/>
+      </w:pPr>
+      <w:r>
+        <w:t xml:space="preserve">Me responsabilicé de integraciones complejas, como </w:t>
+      </w:r>
+      <w:r>
+        <w:rPr>
+          <w:b/>
+        </w:rPr>
+        <w:t>Segment CDP y Airship</w:t>
+      </w:r>
+      <w:r>
+        <w:t>, en colaboración con los equipos de marketing y analítica para cubrir los requisitos de seguimiento, interacción y datos de clientes</w:t>
       </w:r>
     </w:p>
     <w:p>
@@ -152,7 +227,25 @@
         <w:pStyle w:val="ListBullet"/>
       </w:pPr>
       <w:r>
-        <w:t>Soy responsable de las decisiones técnicas del equipo móvil, incluida la estrategia de pruebas, los pipelines CI/CD, los estándares de código y las revisiones de arquitectura</w:t>
+        <w:t xml:space="preserve">Optimicé los </w:t>
+      </w:r>
+      <w:r>
+        <w:rPr>
+          <w:b/>
+        </w:rPr>
+        <w:t>pipelines CI/CD de GitHub Actions/Fastlane</w:t>
+      </w:r>
+      <w:r>
+        <w:t xml:space="preserve">, reduciendo el tiempo de ejecución un </w:t>
+      </w:r>
+      <w:r>
+        <w:rPr>
+          <w:b/>
+        </w:rPr>
+        <w:t>47 %</w:t>
+      </w:r>
+      <w:r>
+        <w:t xml:space="preserve"> y acelerando los ciclos de desarrollo y publicación</w:t>
       </w:r>
     </w:p>
     <w:p>
@@ -160,23 +253,16 @@
         <w:pStyle w:val="ListBullet"/>
       </w:pPr>
       <w:r>
-        <w:t>Dirijo integraciones complejas de terceros, como Airship, Segment y la infraestructura de analítica</w:t>
+        <w:t xml:space="preserve">Soy responsable de la arquitectura, las decisiones técnicas y la entrega de funcionalidades complejas, mientras </w:t>
       </w:r>
-    </w:p>
-    <w:p>
-      <w:pPr>
-        <w:pStyle w:val="ListBullet"/>
-      </w:pPr>
       <w:r>
-        <w:t>Colaboro con los responsables de producto, diseño y backend para evaluar la viabilidad de la hoja de ruta y definir las prioridades técnicas</w:t>
+        <w:rPr>
+          <w:b/>
+        </w:rPr>
+        <w:t>acompaño a 5 ingenieros</w:t>
       </w:r>
-    </w:p>
-    <w:p>
-      <w:pPr>
-        <w:pStyle w:val="ListBullet"/>
-      </w:pPr>
       <w:r>
-        <w:t>Acompaño a los ingenieros en arquitectura, gestión de estado con BLoC y calidad del código, mejorando la eficacia y la coherencia del trabajo del equipo</w:t>
+        <w:t>, reviso pull requests e impulso los estándares de ingeniería del equipo móvil</w:t>
       </w:r>
     </w:p>
     <w:p>
@@ -192,7 +278,7 @@
         <w:keepNext/>
       </w:pPr>
       <w:r>
-        <w:t>En remoto (empresa con sede en EE. UU.) · Septiembre de 2021 a agosto de 2025</w:t>
+        <w:t>En remoto · Septiembre de 2021 a agosto de 2025</w:t>
       </w:r>
     </w:p>
     <w:p>
@@ -337,7 +423,7 @@
         <w:pStyle w:val="Heading1"/>
       </w:pPr>
       <w:r>
-        <w:t>Productos</w:t>
+        <w:t>Productos independientes</w:t>
       </w:r>
     </w:p>
     <w:p>
@@ -345,7 +431,7 @@
         <w:pStyle w:val="Heading2"/>
       </w:pPr>
       <w:r>
-        <w:t>Fundador y desarrollador de Receipto</w:t>
+        <w:t>Fundador e ingeniero móvil en AppWrapp LLC</w:t>
       </w:r>
     </w:p>
     <w:p>
@@ -353,7 +439,12 @@
         <w:keepNext/>
       </w:pPr>
       <w:r>
-        <w:t xml:space="preserve">Málaga · Mayo de 2025 a la actualidad · </w:t>
+        <w:t>Málaga, España · En remoto · Enero de 2024 a la actualidad</w:t>
+      </w:r>
+    </w:p>
+    <w:p>
+      <w:r>
+        <w:t xml:space="preserve">Desarrollo y mantengo productos de software independientes a través de </w:t>
       </w:r>
       <w:hyperlink r:id="rId14">
         <w:r>
@@ -361,103 +452,53 @@
             <w:color w:val="000000"/>
             <w:u w:val="single"/>
           </w:rPr>
-          <w:t>receipto.app</w:t>
+          <w:t>AppWrapp</w:t>
         </w:r>
       </w:hyperlink>
-      <w:r/>
-    </w:p>
-    <w:p>
       <w:r>
-        <w:t>Desarrollé y lancé una aplicación iOS para escanear recibos y gestionar gastos mediante IA, que genera ingresos recurrentes y cuenta con más de 400 valoraciones en el App Store. Responsabilidad completa sobre el producto, la arquitectura, la integración de IA, la optimización en el App Store y la adquisición de pago. Incluye reconocimiento de texto con IA, una bandeja Magic Email para procesar recibos automáticamente y exportaciones para la preparación de impuestos.</w:t>
+        <w:t>, responsabilizándome del desarrollo de producto, la arquitectura técnica, las integraciones, las publicaciones y las mejoras continuas.</w:t>
       </w:r>
     </w:p>
     <w:p>
       <w:pPr>
-        <w:pStyle w:val="Heading2"/>
+        <w:pStyle w:val="ListBullet"/>
       </w:pPr>
-      <w:r>
-        <w:t>Fundador y desarrollador de Fielduro</w:t>
-      </w:r>
-    </w:p>
-    <w:p>
-      <w:pPr>
-        <w:keepNext/>
-      </w:pPr>
-      <w:r>
-        <w:t xml:space="preserve">Málaga · Actualidad · </w:t>
-      </w:r>
+      <w:r/>
       <w:hyperlink r:id="rId15">
         <w:r>
           <w:rPr>
             <w:color w:val="000000"/>
             <w:u w:val="single"/>
           </w:rPr>
-          <w:t>fielduro.com</w:t>
+          <w:t>Receipto</w:t>
         </w:r>
       </w:hyperlink>
-      <w:r/>
-    </w:p>
-    <w:p>
       <w:r>
-        <w:t>Desarrollé un producto para profesionales y empresas de servicios independientes que conecta presupuestos, órdenes de trabajo, facturas y recibos. Diseñé documentos vinculados a cada trabajo, PDF listos para enviar a clientes y seguimiento de pagos.</w:t>
+        <w:t>: Desarrollé y lancé una aplicación de gestión de recibos con escaneo inteligente, procesamiento automático de recibos por correo electrónico y funciones de exportación para autónomos y pequeñas empresas.</w:t>
       </w:r>
     </w:p>
     <w:p>
       <w:pPr>
-        <w:pStyle w:val="Heading2"/>
+        <w:pStyle w:val="ListBullet"/>
       </w:pPr>
-      <w:r>
-        <w:t>Fundador y desarrollador de Flura</w:t>
-      </w:r>
-    </w:p>
-    <w:p>
-      <w:pPr>
-        <w:keepNext/>
-      </w:pPr>
-      <w:r>
-        <w:t xml:space="preserve">Málaga · Enero de 2026 a la actualidad · </w:t>
-      </w:r>
+      <w:r/>
       <w:hyperlink r:id="rId16">
         <w:r>
           <w:rPr>
             <w:color w:val="000000"/>
             <w:u w:val="single"/>
           </w:rPr>
-          <w:t>flura.app</w:t>
+          <w:t>Fielduro</w:t>
         </w:r>
       </w:hyperlink>
-      <w:r/>
-    </w:p>
-    <w:p>
       <w:r>
-        <w:t>Desarrollé y lancé una aplicación de seguimiento de salud para personas con enfermedades crónicas, con reconocimiento de patrones mediante IA e informes PDF estructurados para médicos. Responsabilidad de principio a fin: aplicación Flutter, generación de informes con IA, infraestructura de analítica y estrategia de crecimiento.</w:t>
+        <w:t>: Desarrollé flujos de trabajo conectados para presupuestos, órdenes de trabajo, facturas y recibos, con PDF listos para enviar a clientes y seguimiento de pagos para profesionales y empresas de servicios independientes.</w:t>
       </w:r>
     </w:p>
     <w:p>
       <w:pPr>
-        <w:pStyle w:val="Heading1"/>
+        <w:pStyle w:val="ListBullet"/>
       </w:pPr>
-      <w:r>
-        <w:t>Certificaciones</w:t>
-      </w:r>
-    </w:p>
-    <w:p>
-      <w:pPr>
-        <w:pStyle w:val="Heading2"/>
-      </w:pPr>
-      <w:r>
-        <w:t>Certificado profesional de desarrollador iOS, Meta</w:t>
-      </w:r>
-    </w:p>
-    <w:p>
-      <w:pPr>
-        <w:keepNext w:val="0"/>
-      </w:pPr>
-      <w:r>
-        <w:t>Agosto de 2024 a noviembre de 2024</w:t>
-      </w:r>
-    </w:p>
-    <w:p>
       <w:r/>
       <w:hyperlink r:id="rId17">
         <w:r>
@@ -465,39 +506,17 @@
             <w:color w:val="000000"/>
             <w:u w:val="single"/>
           </w:rPr>
-          <w:t>Verificar el certificado de iOS en Coursera</w:t>
+          <w:t>Flura</w:t>
         </w:r>
       </w:hyperlink>
-      <w:r/>
-    </w:p>
-    <w:p>
-      <w:pPr>
-        <w:pStyle w:val="Heading2"/>
-      </w:pPr>
       <w:r>
-        <w:t>Certificado de React Native, Meta</w:t>
+        <w:t>: Desarrollé y lancé una aplicación de seguimiento de salud para personas con enfermedades crónicas, con registro de síntomas, historial de salud e informes que se pueden compartir en las consultas médicas.</w:t>
       </w:r>
     </w:p>
     <w:p>
-      <w:pPr>
-        <w:keepNext w:val="0"/>
-      </w:pPr>
       <w:r>
-        <w:t>2024</w:t>
+        <w:t>Mis responsabilidades técnicas abarcan el desarrollo de aplicaciones, las integraciones backend, la facturación de suscripciones, la analítica, la optimización en el App Store y el crecimiento del producto.</w:t>
       </w:r>
-    </w:p>
-    <w:p>
-      <w:r/>
-      <w:hyperlink r:id="rId18">
-        <w:r>
-          <w:rPr>
-            <w:color w:val="000000"/>
-            <w:u w:val="single"/>
-          </w:rPr>
-          <w:t>Verificar el certificado de React Native en Coursera</w:t>
-        </w:r>
-      </w:hyperlink>
-      <w:r/>
     </w:p>
     <w:p>
       <w:pPr>
@@ -528,12 +547,49 @@
         <w:pStyle w:val="Heading1"/>
       </w:pPr>
       <w:r>
+        <w:t>Certificaciones</w:t>
+      </w:r>
+    </w:p>
+    <w:p>
+      <w:pPr>
+        <w:pStyle w:val="Heading2"/>
+      </w:pPr>
+      <w:r>
+        <w:t>Certificado profesional de desarrollador iOS, Meta</w:t>
+      </w:r>
+    </w:p>
+    <w:p>
+      <w:pPr>
+        <w:keepNext w:val="0"/>
+      </w:pPr>
+      <w:r>
+        <w:t>Agosto de 2024 a noviembre de 2024</w:t>
+      </w:r>
+    </w:p>
+    <w:p>
+      <w:r/>
+      <w:hyperlink r:id="rId18">
+        <w:r>
+          <w:rPr>
+            <w:color w:val="000000"/>
+            <w:u w:val="single"/>
+          </w:rPr>
+          <w:t>Verificar el certificado de iOS en Coursera</w:t>
+        </w:r>
+      </w:hyperlink>
+      <w:r/>
+    </w:p>
+    <w:p>
+      <w:pPr>
+        <w:pStyle w:val="Heading1"/>
+      </w:pPr>
+      <w:r>
         <w:t>Competencias</w:t>
       </w:r>
     </w:p>
     <w:p>
       <w:r>
-        <w:t>Flutter/Dart; Swift/SwiftUI; Kotlin/Java; React Native; NestJS/TypeScript; Suite de Firebase; PostgreSQL; Clean Architecture; MVC/MVVM; Riverpod/Provider; BLoC/Cubit; API REST/GraphQL; Git/GitFlow; Codemagic; Pruebas unitarias, de integración y de interfaz; Desarrollo guiado por pruebas (TDD); Metodologías ágiles (Scrum/Kanban); Liderazgo y gestión de equipos</w:t>
+        <w:t>Flutter/Dart; Swift/SwiftUI; Kotlin/Java; NestJS/TypeScript; Clean Architecture; MVC/MVVM; Riverpod/Provider; BLoC/Cubit; API REST/GraphQL; Git/GitFlow; Codemagic; Pruebas unitarias, de integración y de interfaz; Desarrollo guiado por pruebas (TDD); Metodologías ágiles (Scrum/Kanban); Liderazgo y gestión de equipos</w:t>
       </w:r>
     </w:p>
     <w:p>

</xml_diff>